<commit_message>
Fill in student name and group (Kulush Askhat, IT1CCO-2402IS)
Co-Authored-By: Claude Opus 5.5 <noreply@anthropic.com>
Claude-Session: https://claude.ai/code/session_012RYRTWe7K8pEBRxnujF3uJ
</commit_message>
<xml_diff>
--- a/lab-01-subject-area-analysis/lab-01-subject-area-analysis.docx
+++ b/lab-01-subject-area-analysis/lab-01-subject-area-analysis.docx
@@ -233,7 +233,13 @@
         <w:t xml:space="preserve"> </w:t>
       </w:r>
       <w:r>
-        <w:t xml:space="preserve">____________________</w:t>
+        <w:t xml:space="preserve">Kulush</w:t>
+      </w:r>
+      <w:r>
+        <w:t xml:space="preserve"> </w:t>
+      </w:r>
+      <w:r>
+        <w:t xml:space="preserve">Askhat</w:t>
       </w:r>
       <w:r>
         <w:t xml:space="preserve"> </w:t>
@@ -251,7 +257,7 @@
         <w:t xml:space="preserve"> </w:t>
       </w:r>
       <w:r>
-        <w:t xml:space="preserve">________</w:t>
+        <w:t xml:space="preserve">IT1CCO-2402IS</w:t>
       </w:r>
       <w:r>
         <w:t xml:space="preserve"> </w:t>

</xml_diff>